<commit_message>
Yapı dokümanı bugünkü mimariye göre güncellendi
- 5. bölüm kural motoruna göre yeniden yazıldı: iki tür otomatik mail,
  içerik sinyalleri, iş başvurusu ayrımı, kimliğin koda gömülmemesi,
  modele ne gösterildiği (6 yeni alt bölüm)
- 7. bölüme dört yeni bileşen: skorlama.py, gmail_fetch.py, izleyici.py,
  kart.py
- 10. bölüme Gmail kurulumu (IMAP + uygulama şifresi, OAuth gerekçesi)
- 13. Görünürlük bölümü eklendi
- Klasör yapısı, yol haritası ve bilinen sınırlar güncellendi

263 -> 315 paragraf. XSD doğrulaması geçti.

Co-Authored-By: Claude Opus 5 <noreply@anthropic.com>
</commit_message>
<xml_diff>
--- a/Vellum - Yapi Dokumani.docx
+++ b/Vellum - Yapi Dokumani.docx
@@ -60,7 +60,7 @@
           <w:sz w:val="19"/>
           <w:szCs w:val="19"/>
         </w:rPr>
-        <w:t xml:space="preserve">Sürüm: geliştirme aşaması · Belge tarihi: 7 Eylül 2026</w:t>
+        <w:t xml:space="preserve">Sürüm: geliştirme aşaması · Belge tarihi: 8 Eylül 2026</w:t>
       </w:r>
     </w:p>
     <w:p>
@@ -717,7 +717,7 @@
                 <w:sz w:val="19"/>
                 <w:szCs w:val="19"/>
               </w:rPr>
-              <w:t xml:space="preserve">state/raw/gmail.json</w:t>
+              <w:t xml:space="preserve">state/ozetlenecek.json</w:t>
             </w:r>
           </w:p>
         </w:tc>
@@ -740,7 +740,7 @@
                 <w:sz w:val="19"/>
                 <w:szCs w:val="19"/>
               </w:rPr>
-              <w:t xml:space="preserve">state/inbox-digest.json</w:t>
+              <w:t xml:space="preserve">state/ozetler.json</w:t>
             </w:r>
           </w:p>
           <w:p>
@@ -1414,7 +1414,7 @@
           <w:sz w:val="30"/>
           <w:szCs w:val="30"/>
         </w:rPr>
-        <w:t xml:space="preserve">5. Önem skorlaması</w:t>
+        <w:t xml:space="preserve">5. Önem skorlaması — kural motoru</w:t>
       </w:r>
     </w:p>
     <w:p>
@@ -1940,6 +1940,289 @@
     </w:p>
     <w:p>
       <w:pPr>
+        <w:pStyle w:val="Heading2"/>
+        <w:spacing w:after="120" w:before="260"/>
+      </w:pPr>
+      <w:r>
+        <w:rPr>
+          <w:b/>
+          <w:bCs/>
+          <w:sz w:val="26"/>
+          <w:szCs w:val="26"/>
+        </w:rPr>
+        <w:t xml:space="preserve">5.1 Kural motoru, model değil</w:t>
+      </w:r>
+    </w:p>
+    <w:p>
+      <w:pPr>
+        <w:spacing w:after="200" w:line="276"/>
+      </w:pPr>
+      <w:r>
+        <w:rPr>
+          <w:sz w:val="22"/>
+          <w:szCs w:val="22"/>
+        </w:rPr>
+        <w:t xml:space="preserve">Skorlama modelde değil kodda yapılır: rubrik config/onem-kurallari.md içinde belgelenir, panel/skorlama.py içinde uygulanır.</w:t>
+      </w:r>
+    </w:p>
+    <w:p>
+      <w:pPr>
+        <w:spacing w:after="200" w:line="276"/>
+      </w:pPr>
+      <w:r>
+        <w:rPr>
+          <w:sz w:val="22"/>
+          <w:szCs w:val="22"/>
+        </w:rPr>
+        <w:t xml:space="preserve">Bu karar ölçümle alındı. İlk canlı taramada mail-agent 32 mailin gövdesini tek turda okudu: 104.192 giriş, 16.000 çıkış token, süre dakikalar. Oysa gelen kutusundaki 32 mailin 30'u iş ilanı bülteniydi — model, bültenleri okumak için çalıştırılıyordu. Rubrik zaten deterministik bir kural tablosu olduğundan hesabı modele yaptırmanın karşılığı yoktu. Model artık yalnızca eşiği geçen birkaç maile özet, aksiyon ve taslak yazar.</w:t>
+      </w:r>
+    </w:p>
+    <w:p>
+      <w:pPr>
+        <w:pStyle w:val="Heading2"/>
+        <w:spacing w:after="120" w:before="260"/>
+      </w:pPr>
+      <w:r>
+        <w:rPr>
+          <w:b/>
+          <w:bCs/>
+          <w:sz w:val="26"/>
+          <w:szCs w:val="26"/>
+        </w:rPr>
+        <w:t xml:space="preserve">5.2 İki tür otomatik mail</w:t>
+      </w:r>
+    </w:p>
+    <w:p>
+      <w:pPr>
+        <w:spacing w:after="200" w:line="276"/>
+      </w:pPr>
+      <w:r>
+        <w:rPr>
+          <w:sz w:val="22"/>
+          <w:szCs w:val="22"/>
+        </w:rPr>
+        <w:t xml:space="preserve">Ayrım önemlidir, yoksa mülakat davetleri bültenlerle birlikte elenir:</w:t>
+      </w:r>
+    </w:p>
+    <w:p>
+      <w:pPr>
+        <w:pStyle w:val="ListParagraph"/>
+        <w:numPr>
+          <w:ilvl w:val="0"/>
+          <w:numId w:val="2"/>
+        </w:numPr>
+        <w:spacing w:after="90" w:line="276"/>
+      </w:pPr>
+      <w:r>
+        <w:rPr>
+          <w:sz w:val="21"/>
+          <w:szCs w:val="21"/>
+        </w:rPr>
+        <w:t xml:space="preserve">Bülten — List-Unsubscribe veya List-Id başlığı taşır. Gerçek bir mülakat daveti abonelikten çıkma bağlantısıyla gelmez; bu yüzden bülten hiçbir koşulda ilerleme sayılmaz.</w:t>
+      </w:r>
+    </w:p>
+    <w:p>
+      <w:pPr>
+        <w:pStyle w:val="ListParagraph"/>
+        <w:numPr>
+          <w:ilvl w:val="0"/>
+          <w:numId w:val="2"/>
+        </w:numPr>
+        <w:spacing w:after="90" w:line="276"/>
+      </w:pPr>
+      <w:r>
+        <w:rPr>
+          <w:sz w:val="21"/>
+          <w:szCs w:val="21"/>
+        </w:rPr>
+        <w:t xml:space="preserve">İşlem maili — noreply türü adresten gelen bildirim. Başvuru sistemleri mülakat davetini de böyle gönderir, o yüzden içeriğine bakılır.</w:t>
+      </w:r>
+    </w:p>
+    <w:p>
+      <w:pPr>
+        <w:spacing w:after="200" w:line="276"/>
+      </w:pPr>
+      <w:r>
+        <w:rPr>
+          <w:sz w:val="22"/>
+          <w:szCs w:val="22"/>
+        </w:rPr>
+        <w:t xml:space="preserve">Bu ayrım olmadan, gövdesinde “Interview” kelimesi geçen bir iş ilanı bülteni 60 puan alıyordu.</w:t>
+      </w:r>
+    </w:p>
+    <w:p>
+      <w:pPr>
+        <w:pStyle w:val="Heading2"/>
+        <w:spacing w:after="120" w:before="260"/>
+      </w:pPr>
+      <w:r>
+        <w:rPr>
+          <w:b/>
+          <w:bCs/>
+          <w:sz w:val="26"/>
+          <w:szCs w:val="26"/>
+        </w:rPr>
+        <w:t xml:space="preserve">5.3 İçerik sinyalleri yalnızca size yazılmış maillerde sayılır</w:t>
+      </w:r>
+    </w:p>
+    <w:p>
+      <w:pPr>
+        <w:spacing w:after="200" w:line="276"/>
+      </w:pPr>
+      <w:r>
+        <w:rPr>
+          <w:sz w:val="22"/>
+          <w:szCs w:val="22"/>
+        </w:rPr>
+        <w:t xml:space="preserve">Pazarlama metni her zaman tarih (“son 3 gün”), fiyat (“199 TL”) ve soru (“kaçırmak ister misiniz?”) taşır. Bunlar sayıldığında toplu gönderim cezasını geri kapatıyor ve bir indirim maili aksiyon olarak brifingin başına çıkıyordu — ölçüldü, çıkıyordu. Toplu gönderimde tarih, para ve soru sinyalleri hesaplanmaz; VIP'ten geliyorsa ya da başvuru ilerlemesiyse hesaplanır.</w:t>
+      </w:r>
+    </w:p>
+    <w:p>
+      <w:pPr>
+        <w:pStyle w:val="Heading2"/>
+        <w:spacing w:after="120" w:before="260"/>
+      </w:pPr>
+      <w:r>
+        <w:rPr>
+          <w:b/>
+          <w:bCs/>
+          <w:sz w:val="26"/>
+          <w:szCs w:val="26"/>
+        </w:rPr>
+        <w:t xml:space="preserve">5.4 İş başvurusu ayrımı</w:t>
+      </w:r>
+    </w:p>
+    <w:p>
+      <w:pPr>
+        <w:spacing w:after="200" w:line="276"/>
+      </w:pPr>
+      <w:r>
+        <w:rPr>
+          <w:sz w:val="22"/>
+          <w:szCs w:val="22"/>
+        </w:rPr>
+        <w:t xml:space="preserve">Kullanıcının açık tercihi: başvuru onayları (“başvurunuz alındı”) önemli değil, şirketten gelen ilerleme (mülakat, teklif, değerlendirme sonucu) önemli. Ayrım gönderene değil konuya bakar — aynı adresten ikisi de gelebilir.</w:t>
+      </w:r>
+    </w:p>
+    <w:p>
+      <w:pPr>
+        <w:pStyle w:val="Heading2"/>
+        <w:spacing w:after="120" w:before="260"/>
+      </w:pPr>
+      <w:r>
+        <w:rPr>
+          <w:b/>
+          <w:bCs/>
+          <w:sz w:val="26"/>
+          <w:szCs w:val="26"/>
+        </w:rPr>
+        <w:t xml:space="preserve">5.5 Kullanıcı kimliği koda gömülmez</w:t>
+      </w:r>
+    </w:p>
+    <w:p>
+      <w:pPr>
+        <w:spacing w:after="200" w:line="276"/>
+      </w:pPr>
+      <w:r>
+        <w:rPr>
+          <w:sz w:val="22"/>
+          <w:szCs w:val="22"/>
+        </w:rPr>
+        <w:t xml:space="preserve">“Doğrudan sana yazılmış” ve “CC” sinyalleri kullanıcının adresini bilmeyi gerektirir. Bu adres çalışma anında secrets/.env içindeki GMAIL_ADRES alanından okunur; çözülemezse iki sinyal tahmin edilmez, atlanır. Program başka bir hesapla kurulduğunda kendiliğinden o kullanıcıya göre çalışır. Birim testleri uydurma adreslerle yazılır: 28 test, scripts/test_skorlama.py.</w:t>
+      </w:r>
+    </w:p>
+    <w:p>
+      <w:pPr>
+        <w:pStyle w:val="Heading2"/>
+        <w:spacing w:after="120" w:before="260"/>
+      </w:pPr>
+      <w:r>
+        <w:rPr>
+          <w:b/>
+          <w:bCs/>
+          <w:sz w:val="26"/>
+          <w:szCs w:val="26"/>
+        </w:rPr>
+        <w:t xml:space="preserve">5.6 Modele ne gösterildiği</w:t>
+      </w:r>
+    </w:p>
+    <w:p>
+      <w:pPr>
+        <w:spacing w:after="200" w:line="276"/>
+      </w:pPr>
+      <w:r>
+        <w:rPr>
+          <w:sz w:val="22"/>
+          <w:szCs w:val="22"/>
+        </w:rPr>
+        <w:t xml:space="preserve">Skorlama ucuzladıktan sonra ikinci bir israf kaldı: ajana “gövdeleri state/raw/gmail.json içinde bul” deniyordu. Ajan 100 KB'lık dosyanın tamamını okuyor, tool döngüsünün her turunda o içerik yeniden gönderiliyordu. Üstüne 19,5 KB'lık digest'i baştan yazıyordu. İki mail özetlemek yaklaşık 0,24 dolar tutuyordu.</w:t>
+      </w:r>
+    </w:p>
+    <w:p>
+      <w:pPr>
+        <w:pStyle w:val="ListParagraph"/>
+        <w:numPr>
+          <w:ilvl w:val="0"/>
+          <w:numId w:val="2"/>
+        </w:numPr>
+        <w:spacing w:after="90" w:line="276"/>
+      </w:pPr>
+      <w:r>
+        <w:rPr>
+          <w:sz w:val="21"/>
+          <w:szCs w:val="21"/>
+        </w:rPr>
+        <w:t xml:space="preserve">Ajana yalnızca işleyeceği veri verilir: state/ozetlenecek.json, eşiği geçen maillerin gövdeleriyle. İki mail için 1,2 KB.</w:t>
+      </w:r>
+    </w:p>
+    <w:p>
+      <w:pPr>
+        <w:pStyle w:val="ListParagraph"/>
+        <w:numPr>
+          <w:ilvl w:val="0"/>
+          <w:numId w:val="2"/>
+        </w:numPr>
+        <w:spacing w:after="90" w:line="276"/>
+      </w:pPr>
+      <w:r>
+        <w:rPr>
+          <w:sz w:val="21"/>
+          <w:szCs w:val="21"/>
+        </w:rPr>
+        <w:t xml:space="preserve">Ajan büyük dosyayı geri yazmaz. Özetler küçük bir state/ozetler.json dosyasına yazılır; digest ile birleştirmeyi sistem yapar.</w:t>
+      </w:r>
+    </w:p>
+    <w:p>
+      <w:pPr>
+        <w:pStyle w:val="ListParagraph"/>
+        <w:numPr>
+          <w:ilvl w:val="0"/>
+          <w:numId w:val="2"/>
+        </w:numPr>
+        <w:spacing w:after="90" w:line="276"/>
+      </w:pPr>
+      <w:r>
+        <w:rPr>
+          <w:sz w:val="21"/>
+          <w:szCs w:val="21"/>
+        </w:rPr>
+        <w:t xml:space="preserve">Çekirdek ve proje-agent süzülmüş görünüm okur: state/brifing-girdisi.json yalnızca eşiği geçenleri taşır, elenenler tek bir sayıdır.</w:t>
+      </w:r>
+    </w:p>
+    <w:p>
+      <w:pPr>
+        <w:spacing w:after="200" w:line="276"/>
+      </w:pPr>
+      <w:r>
+        <w:rPr>
+          <w:sz w:val="22"/>
+          <w:szCs w:val="22"/>
+        </w:rPr>
+        <w:t xml:space="preserve">Ölçülen sonuç: mail özeti başına yaklaşık 0,236 dolardan 0,005 dolara. Genel ilke: bir ajanın okuduğu her dosya, döngünün her turunda yeniden faturalanır; ajanın girdisini dar tutmak, ajanı kısıtlamaktan daha etkilidir.</w:t>
+      </w:r>
+    </w:p>
+    <w:p>
+      <w:pPr>
         <w:pStyle w:val="Heading1"/>
         <w:spacing w:after="140" w:before="360"/>
       </w:pPr>
@@ -3215,6 +3498,189 @@
     </w:p>
     <w:p>
       <w:pPr>
+        <w:pStyle w:val="Heading2"/>
+        <w:spacing w:after="120" w:before="260"/>
+      </w:pPr>
+      <w:r>
+        <w:rPr>
+          <w:b/>
+          <w:bCs/>
+          <w:sz w:val="26"/>
+          <w:szCs w:val="26"/>
+        </w:rPr>
+        <w:t xml:space="preserve">7.3 skorlama.py — kural motoru</w:t>
+      </w:r>
+    </w:p>
+    <w:p>
+      <w:pPr>
+        <w:spacing w:after="200" w:line="276"/>
+      </w:pPr>
+      <w:r>
+        <w:rPr>
+          <w:sz w:val="22"/>
+          <w:szCs w:val="22"/>
+        </w:rPr>
+        <w:t xml:space="preserve">Rubriği deterministik uygular, model çağırmaz. Her mail için ham skor, kırpılmış skor, skoru oluşturan sinyaller ve kategori üretir; digest'i yazar ve modele gidecek süzülmüş görünümü hazırlar. Hem tarama hem canlı izleyici bu aynı fonksiyonu kullanır: mail hangi yoldan gelirse gelsin aynı şekilde puanlanır.</w:t>
+      </w:r>
+    </w:p>
+    <w:p>
+      <w:pPr>
+        <w:pStyle w:val="Heading2"/>
+        <w:spacing w:after="120" w:before="260"/>
+      </w:pPr>
+      <w:r>
+        <w:rPr>
+          <w:b/>
+          <w:bCs/>
+          <w:sz w:val="26"/>
+          <w:szCs w:val="26"/>
+        </w:rPr>
+        <w:t xml:space="preserve">7.4 gmail_fetch.py — veri çekme</w:t>
+      </w:r>
+    </w:p>
+    <w:p>
+      <w:pPr>
+        <w:spacing w:after="200" w:line="276"/>
+      </w:pPr>
+      <w:r>
+        <w:rPr>
+          <w:sz w:val="22"/>
+          <w:szCs w:val="22"/>
+        </w:rPr>
+        <w:t xml:space="preserve">IMAP ve Google uygulama şifresi ile bağlanır; OAuth, Cloud projesi ve onay ekranı yoktur. Kutu readonly açılır: sunucudaki okundu bayrağı bile değişmez, gönderim yolu hiç açılmaz. Kimlikler IMAP sıra numarası değil UID'dir — sıra numaraları yeni mail geldikçe kayar, taramalar arası eşleştirme ancak UID ile doğru olur.</w:t>
+      </w:r>
+    </w:p>
+    <w:p>
+      <w:pPr>
+        <w:spacing w:after="200" w:line="276"/>
+      </w:pPr>
+      <w:r>
+        <w:rPr>
+          <w:sz w:val="22"/>
+          <w:szCs w:val="22"/>
+        </w:rPr>
+        <w:t xml:space="preserve">Çekilen her mail state/raw/arsiv.jsonl içinde kalıcı olarak birikir. gmail.json yalnızca son pencereyi taşır; böylece tarama maliyeti sabit kalır, geçmiş arşivde durur.</w:t>
+      </w:r>
+    </w:p>
+    <w:p>
+      <w:pPr>
+        <w:pStyle w:val="Heading2"/>
+        <w:spacing w:after="120" w:before="260"/>
+      </w:pPr>
+      <w:r>
+        <w:rPr>
+          <w:b/>
+          <w:bCs/>
+          <w:sz w:val="26"/>
+          <w:szCs w:val="26"/>
+        </w:rPr>
+        <w:t xml:space="preserve">7.5 izleyici.py — canlı izleme</w:t>
+      </w:r>
+    </w:p>
+    <w:p>
+      <w:pPr>
+        <w:spacing w:after="200" w:line="276"/>
+      </w:pPr>
+      <w:r>
+        <w:rPr>
+          <w:sz w:val="22"/>
+          <w:szCs w:val="22"/>
+        </w:rPr>
+        <w:t xml:space="preserve">imaplib bu Python sürümünde IDLE desteklemediği için 60 saniyelik yoklama kullanılır. IMAP sorgusu ücretsizdir, gecikme en fazla bir dakikadır.</w:t>
+      </w:r>
+    </w:p>
+    <w:p>
+      <w:pPr>
+        <w:pStyle w:val="ListParagraph"/>
+        <w:numPr>
+          <w:ilvl w:val="0"/>
+          <w:numId w:val="2"/>
+        </w:numPr>
+        <w:spacing w:after="90" w:line="276"/>
+      </w:pPr>
+      <w:r>
+        <w:rPr>
+          <w:sz w:val="21"/>
+          <w:szCs w:val="21"/>
+        </w:rPr>
+        <w:t xml:space="preserve">İzleyici model çağırmaz: kural motoruyla puanlar, eşiği geçerse bildirir. Gün boyu izleme bedavadır.</w:t>
+      </w:r>
+    </w:p>
+    <w:p>
+      <w:pPr>
+        <w:pStyle w:val="ListParagraph"/>
+        <w:numPr>
+          <w:ilvl w:val="0"/>
+          <w:numId w:val="2"/>
+        </w:numPr>
+        <w:spacing w:after="90" w:line="276"/>
+      </w:pPr>
+      <w:r>
+        <w:rPr>
+          <w:sz w:val="21"/>
+          <w:szCs w:val="21"/>
+        </w:rPr>
+        <w:t xml:space="preserve">Yeni mail yalnızca bildirilmez, sisteme de düşer: gmail.json, arsiv.jsonl ve digest güncellenir. Bildirim tek başına yetmez — mail Posta listesinde de görünmelidir.</w:t>
+      </w:r>
+    </w:p>
+    <w:p>
+      <w:pPr>
+        <w:pStyle w:val="ListParagraph"/>
+        <w:numPr>
+          <w:ilvl w:val="0"/>
+          <w:numId w:val="2"/>
+        </w:numPr>
+        <w:spacing w:after="90" w:line="276"/>
+      </w:pPr>
+      <w:r>
+        <w:rPr>
+          <w:sz w:val="21"/>
+          <w:szCs w:val="21"/>
+        </w:rPr>
+        <w:t xml:space="preserve">UID koruması: kayıtlı UID kutununkinden büyükse geçersiz sayılıp kutunun sonuna hizalanır. Bu, kutu yeniden oluşturulduğunda sistemi sağlam tutar.</w:t>
+      </w:r>
+    </w:p>
+    <w:p>
+      <w:pPr>
+        <w:pStyle w:val="Heading2"/>
+        <w:spacing w:after="120" w:before="260"/>
+      </w:pPr>
+      <w:r>
+        <w:rPr>
+          <w:b/>
+          <w:bCs/>
+          <w:sz w:val="26"/>
+          <w:szCs w:val="26"/>
+        </w:rPr>
+        <w:t xml:space="preserve">7.6 kart.py — bildirim kartı</w:t>
+      </w:r>
+    </w:p>
+    <w:p>
+      <w:pPr>
+        <w:spacing w:after="200" w:line="276"/>
+      </w:pPr>
+      <w:r>
+        <w:rPr>
+          <w:sz w:val="22"/>
+          <w:szCs w:val="22"/>
+        </w:rPr>
+        <w:t xml:space="preserve">Bildirim, Windows'un kendi kutusu değil, Broadsheet dizgisinde kendi çizdiğimiz penceredir: kağıt zemin, solda camgöbeği şerit, magenta skor rozeti. Ayrı bir süreçte açılır — Tkinter çağrıları tek iş parçacığında kalmak zorundadır, sunucunun içinden pencere açmak kırılgan olurdu. Kart çizilemezse Windows bildirimine düşülür; izleyici hiçbir durumda durmaz.</w:t>
+      </w:r>
+    </w:p>
+    <w:p>
+      <w:pPr>
+        <w:spacing w:after="200" w:line="276"/>
+      </w:pPr>
+      <w:r>
+        <w:rPr>
+          <w:sz w:val="22"/>
+          <w:szCs w:val="22"/>
+        </w:rPr>
+        <w:t xml:space="preserve">Bedeli: kart Windows Bildirim Merkezi'ne iz bırakmaz. Kaçırılan bir kart orada bulunamaz, ama panelde bildirim listesinde durmaya devam eder.</w:t>
+      </w:r>
+    </w:p>
+    <w:p>
+      <w:pPr>
         <w:pStyle w:val="Heading1"/>
         <w:spacing w:after="140" w:before="360"/>
       </w:pPr>
@@ -3518,7 +3984,7 @@
           <w:sz w:val="17"/>
           <w:szCs w:val="17"/>
         </w:rPr>
-        <w:t xml:space="preserve">assistant/</w:t>
+        <w:t xml:space="preserve">vellum/</w:t>
       </w:r>
     </w:p>
     <w:p>
@@ -3713,22 +4179,22 @@
           <w:sz w:val="17"/>
           <w:szCs w:val="17"/>
         </w:rPr>
-        <w:t xml:space="preserve">│   ├── raw/                 ham veri + mail ekleri</w:t>
-      </w:r>
-    </w:p>
-    <w:p>
-      <w:pPr>
-        <w:shd w:fill="F3F2F2" w:val="clear"/>
-        <w:spacing w:after="0" w:line="240"/>
-        <w:ind w:left="220" w:right="220"/>
-      </w:pPr>
-      <w:r>
-        <w:rPr>
-          <w:rFonts w:ascii="Consolas" w:cs="Consolas" w:eastAsia="Consolas" w:hAnsi="Consolas"/>
-          <w:sz w:val="17"/>
-          <w:szCs w:val="17"/>
-        </w:rPr>
-        <w:t xml:space="preserve">│   ├── inbox-digest.json</w:t>
+        <w:t xml:space="preserve">│   ├── raw/                 ham veri + ekler + arsiv.jsonl</w:t>
+      </w:r>
+    </w:p>
+    <w:p>
+      <w:pPr>
+        <w:shd w:fill="F3F2F2" w:val="clear"/>
+        <w:spacing w:after="0" w:line="240"/>
+        <w:ind w:left="220" w:right="220"/>
+      </w:pPr>
+      <w:r>
+        <w:rPr>
+          <w:rFonts w:ascii="Consolas" w:cs="Consolas" w:eastAsia="Consolas" w:hAnsi="Consolas"/>
+          <w:sz w:val="17"/>
+          <w:szCs w:val="17"/>
+        </w:rPr>
+        <w:t xml:space="preserve">│   ├── inbox-digest.json    panelin gördüğü: tüm mailler</w:t>
       </w:r>
     </w:p>
     <w:p>
@@ -3773,6 +4239,66 @@
           <w:sz w:val="17"/>
           <w:szCs w:val="17"/>
         </w:rPr>
+        <w:t xml:space="preserve">│   ├── brifing-girdisi.json modelin gördüğü: eşiği geçenler</w:t>
+      </w:r>
+    </w:p>
+    <w:p>
+      <w:pPr>
+        <w:shd w:fill="F3F2F2" w:val="clear"/>
+        <w:spacing w:after="0" w:line="240"/>
+        <w:ind w:left="220" w:right="220"/>
+      </w:pPr>
+      <w:r>
+        <w:rPr>
+          <w:rFonts w:ascii="Consolas" w:cs="Consolas" w:eastAsia="Consolas" w:hAnsi="Consolas"/>
+          <w:sz w:val="17"/>
+          <w:szCs w:val="17"/>
+        </w:rPr>
+        <w:t xml:space="preserve">│   ├── ozetler.json         modelin ürettiği özet ve taslak</w:t>
+      </w:r>
+    </w:p>
+    <w:p>
+      <w:pPr>
+        <w:shd w:fill="F3F2F2" w:val="clear"/>
+        <w:spacing w:after="0" w:line="240"/>
+        <w:ind w:left="220" w:right="220"/>
+      </w:pPr>
+      <w:r>
+        <w:rPr>
+          <w:rFonts w:ascii="Consolas" w:cs="Consolas" w:eastAsia="Consolas" w:hAnsi="Consolas"/>
+          <w:sz w:val="17"/>
+          <w:szCs w:val="17"/>
+        </w:rPr>
+        <w:t xml:space="preserve">│   ├── bildirimler.jsonl    canlı izleyicinin yakaladıkları</w:t>
+      </w:r>
+    </w:p>
+    <w:p>
+      <w:pPr>
+        <w:shd w:fill="F3F2F2" w:val="clear"/>
+        <w:spacing w:after="0" w:line="240"/>
+        <w:ind w:left="220" w:right="220"/>
+      </w:pPr>
+      <w:r>
+        <w:rPr>
+          <w:rFonts w:ascii="Consolas" w:cs="Consolas" w:eastAsia="Consolas" w:hAnsi="Consolas"/>
+          <w:sz w:val="17"/>
+          <w:szCs w:val="17"/>
+        </w:rPr>
+        <w:t xml:space="preserve">│   ├── sohbet.jsonl         konuşma kaydı</w:t>
+      </w:r>
+    </w:p>
+    <w:p>
+      <w:pPr>
+        <w:shd w:fill="F3F2F2" w:val="clear"/>
+        <w:spacing w:after="0" w:line="240"/>
+        <w:ind w:left="220" w:right="220"/>
+      </w:pPr>
+      <w:r>
+        <w:rPr>
+          <w:rFonts w:ascii="Consolas" w:cs="Consolas" w:eastAsia="Consolas" w:hAnsi="Consolas"/>
+          <w:sz w:val="17"/>
+          <w:szCs w:val="17"/>
+        </w:rPr>
         <w:t xml:space="preserve">│   ├── taslaklar/           onay bekleyen cevaplar</w:t>
       </w:r>
     </w:p>
@@ -3788,7 +4314,7 @@
           <w:sz w:val="17"/>
           <w:szCs w:val="17"/>
         </w:rPr>
-        <w:t xml:space="preserve">│   └── log/                 brifing arşivi</w:t>
+        <w:t xml:space="preserve">│   └── log/                 brifing arşivi + taramalar.jsonl</w:t>
       </w:r>
     </w:p>
     <w:p>
@@ -3848,7 +4374,7 @@
           <w:sz w:val="17"/>
           <w:szCs w:val="17"/>
         </w:rPr>
-        <w:t xml:space="preserve">│   ├── sunucu.py            yerel sunucu</w:t>
+        <w:t xml:space="preserve">│   ├── sunucu.py            yerel sunucu + canlı izleyici</w:t>
       </w:r>
     </w:p>
     <w:p>
@@ -3878,6 +4404,21 @@
           <w:sz w:val="17"/>
           <w:szCs w:val="17"/>
         </w:rPr>
+        <w:t xml:space="preserve">│   ├── skorlama.py          kural motoru (modelsiz)</w:t>
+      </w:r>
+    </w:p>
+    <w:p>
+      <w:pPr>
+        <w:shd w:fill="F3F2F2" w:val="clear"/>
+        <w:spacing w:after="0" w:line="240"/>
+        <w:ind w:left="220" w:right="220"/>
+      </w:pPr>
+      <w:r>
+        <w:rPr>
+          <w:rFonts w:ascii="Consolas" w:cs="Consolas" w:eastAsia="Consolas" w:hAnsi="Consolas"/>
+          <w:sz w:val="17"/>
+          <w:szCs w:val="17"/>
+        </w:rPr>
         <w:t xml:space="preserve">│   ├── panel.html           Tek Ağız yerleşimi</w:t>
       </w:r>
     </w:p>
@@ -3923,7 +4464,7 @@
           <w:sz w:val="17"/>
           <w:szCs w:val="17"/>
         </w:rPr>
-        <w:t xml:space="preserve">├── scripts/                 veri çekme ve demo üretimi</w:t>
+        <w:t xml:space="preserve">├── scripts/                 gmail_fetch · izleyici · kart · testler</w:t>
       </w:r>
     </w:p>
     <w:p>
@@ -4077,6 +4618,69 @@
           <w:szCs w:val="17"/>
         </w:rPr>
         <w:t xml:space="preserve"># sonra tarayıcıda:  http://127.0.0.1:8787</w:t>
+      </w:r>
+    </w:p>
+    <w:p>
+      <w:pPr>
+        <w:pStyle w:val="Heading2"/>
+        <w:spacing w:after="120" w:before="260"/>
+      </w:pPr>
+      <w:r>
+        <w:rPr>
+          <w:b/>
+          <w:bCs/>
+          <w:sz w:val="26"/>
+          <w:szCs w:val="26"/>
+        </w:rPr>
+        <w:t xml:space="preserve">10.1 Gmail bağlantısı</w:t>
+      </w:r>
+    </w:p>
+    <w:p>
+      <w:pPr>
+        <w:spacing w:after="200" w:line="276"/>
+      </w:pPr>
+      <w:r>
+        <w:rPr>
+          <w:sz w:val="22"/>
+          <w:szCs w:val="22"/>
+        </w:rPr>
+        <w:t xml:space="preserve">Bağlantı IMAP ve Google uygulama şifresi ile kurulur; OAuth, Cloud projesi ve onay ekranı yoktur. OAuth yerine bu yol seçildi: test modunda refresh token yedi günde düşüyor, kalıcı çözüm Google doğrulama süreci gerektiriyordu. IMAP ayrıca salt okumayı protokol seviyesinde garanti eder.</w:t>
+      </w:r>
+    </w:p>
+    <w:p>
+      <w:pPr>
+        <w:spacing w:after="200" w:line="276"/>
+      </w:pPr>
+      <w:r>
+        <w:rPr>
+          <w:sz w:val="22"/>
+          <w:szCs w:val="22"/>
+        </w:rPr>
+        <w:t xml:space="preserve">Hesapta iki adımlı doğrulama açık olmalı. Şifre myaccount.google.com/apppasswords adresinden üretilir ve secrets/.env dosyasına GMAIL_ADRES ile GMAIL_UYGULAMA_SIFRESI olarak yazılır.</w:t>
+      </w:r>
+    </w:p>
+    <w:p>
+      <w:pPr>
+        <w:spacing w:after="200" w:line="276"/>
+      </w:pPr>
+      <w:r>
+        <w:rPr>
+          <w:sz w:val="22"/>
+          <w:szCs w:val="22"/>
+        </w:rPr>
+        <w:t xml:space="preserve">Bağlantıyı diske hiçbir şey yazmadan sınamak için: python scripts/gmail_fetch.py --kuru</w:t>
+      </w:r>
+    </w:p>
+    <w:p>
+      <w:pPr>
+        <w:spacing w:after="200" w:line="276"/>
+      </w:pPr>
+      <w:r>
+        <w:rPr>
+          <w:sz w:val="22"/>
+          <w:szCs w:val="22"/>
+        </w:rPr>
+        <w:t xml:space="preserve">Her taramada gelen kutusunun son bir günü, en fazla 50 mail çekilir; gövdeler 2000 karaktere kırpılır. Okunabilir ve 5 MB altındaki ekler state/raw/ekler/ altına iner. Panel açıldığında canlı izleyici de birlikte başlar.</w:t>
       </w:r>
     </w:p>
     <w:p>
@@ -4308,7 +4912,7 @@
                 <w:sz w:val="19"/>
                 <w:szCs w:val="19"/>
               </w:rPr>
-              <w:t xml:space="preserve">Gmail entegrasyonu (OAuth, fetch scripti, canlı gönderim)</w:t>
+              <w:t xml:space="preserve">Gmail entegrasyonu (IMAP fetch, salt okuma)</w:t>
             </w:r>
           </w:p>
         </w:tc>
@@ -4331,7 +4935,7 @@
                 <w:sz w:val="19"/>
                 <w:szCs w:val="19"/>
               </w:rPr>
-              <w:t xml:space="preserve">bekliyor</w:t>
+              <w:t xml:space="preserve">tamam</w:t>
             </w:r>
           </w:p>
         </w:tc>
@@ -4450,7 +5054,7 @@
                 <w:sz w:val="19"/>
                 <w:szCs w:val="19"/>
               </w:rPr>
-              <w:t xml:space="preserve">Zamanlanmış tarama (Windows Task Scheduler) + bildirim</w:t>
+              <w:t xml:space="preserve">Canlı izleme + masaüstü bildirimi</w:t>
             </w:r>
           </w:p>
         </w:tc>
@@ -4473,7 +5077,7 @@
                 <w:sz w:val="19"/>
                 <w:szCs w:val="19"/>
               </w:rPr>
-              <w:t xml:space="preserve">bekliyor</w:t>
+              <w:t xml:space="preserve">tamam</w:t>
             </w:r>
           </w:p>
         </w:tc>
@@ -4880,7 +5484,7 @@
           <w:sz w:val="21"/>
           <w:szCs w:val="21"/>
         </w:rPr>
-        <w:t xml:space="preserve">Gizlilik: mail ve mesaj içerikleri özetleme için modele gönderilir. Ham veri diskte kalır; secrets/ ve .env versiyon kontrolüne girmez.</w:t>
+        <w:t xml:space="preserve">Gizlilik: yalnızca eşiği geçen maillerin içeriği modele gönderilir; gerisi diski hiç terk etmez. Ham veri, digest'ler, taslaklar, bildirimler ve sohbet kaydı versiyon kontrolüne girmez.</w:t>
       </w:r>
     </w:p>
     <w:p>
@@ -4897,7 +5501,7 @@
           <w:sz w:val="21"/>
           <w:szCs w:val="21"/>
         </w:rPr>
-        <w:t xml:space="preserve">Maliyet: her tarama beş API çağrısıdır (dört ajan + harmanlama). Zamanlanmış taramaya geçmeden önce gerçek token kullanımı ölçülmelidir.</w:t>
+        <w:t xml:space="preserve">Maliyet: tarama, bağlı kaynak ve eşiği geçen mail sayısına göre 2-4 API çağrısıdır. Kaynağı bağlı olmayan ajan hiç çağrılmaz; özetlenecek mail yoksa mail ajanı da çağrılmaz. Canlı izleme model çağırmaz. Token kullanımı henüz kaydedilmiyor; maliyet rakamları dosya boyutlarından hesaplanan tahminlerdir.</w:t>
       </w:r>
     </w:p>
     <w:p>
@@ -4949,6 +5553,152 @@
           <w:szCs w:val="21"/>
         </w:rPr>
         <w:t xml:space="preserve">Taranmış (görüntü) PDF eklerinden metin çıkmaz; sistem bu durumda tahmin yürütmeyip kullanıcıya bildirir.</w:t>
+      </w:r>
+    </w:p>
+    <w:p>
+      <w:pPr>
+        <w:pStyle w:val="Heading1"/>
+        <w:spacing w:after="140" w:before="360"/>
+      </w:pPr>
+      <w:r>
+        <w:rPr>
+          <w:b/>
+          <w:bCs/>
+          <w:sz w:val="30"/>
+          <w:szCs w:val="30"/>
+        </w:rPr>
+        <w:t xml:space="preserve">13. Görünürlük</w:t>
+      </w:r>
+    </w:p>
+    <w:p>
+      <w:pPr>
+        <w:spacing w:after="200" w:line="276"/>
+      </w:pPr>
+      <w:r>
+        <w:rPr>
+          <w:sz w:val="22"/>
+          <w:szCs w:val="22"/>
+        </w:rPr>
+        <w:t xml:space="preserve">Kredi bitmesi gibi apaçık bir hatayı bulmak yarım saat aldı, çünkü hata hiçbir yere yazılmıyordu — yalnızca tarayıcıya dönüyordu. Bu deneyimden çıkan kararlar:</w:t>
+      </w:r>
+    </w:p>
+    <w:p>
+      <w:pPr>
+        <w:pStyle w:val="ListParagraph"/>
+        <w:numPr>
+          <w:ilvl w:val="0"/>
+          <w:numId w:val="2"/>
+        </w:numPr>
+        <w:spacing w:after="90" w:line="276"/>
+      </w:pPr>
+      <w:r>
+        <w:rPr>
+          <w:sz w:val="21"/>
+          <w:szCs w:val="21"/>
+        </w:rPr>
+        <w:t xml:space="preserve">Her taramanın sonucu (süre, adımlar, ajan çıktıları, hata) state/log/taramalar.jsonl dosyasına yazılır.</w:t>
+      </w:r>
+    </w:p>
+    <w:p>
+      <w:pPr>
+        <w:pStyle w:val="ListParagraph"/>
+        <w:numPr>
+          <w:ilvl w:val="0"/>
+          <w:numId w:val="2"/>
+        </w:numPr>
+        <w:spacing w:after="90" w:line="276"/>
+      </w:pPr>
+      <w:r>
+        <w:rPr>
+          <w:sz w:val="21"/>
+          <w:szCs w:val="21"/>
+        </w:rPr>
+        <w:t xml:space="preserve">API hataları düz Türkçeye çevrilir: kredi bitti, anahtar geçersiz, hız sınırı, ağ yok. Ham hata metni kullanıcıya gösterilmez.</w:t>
+      </w:r>
+    </w:p>
+    <w:p>
+      <w:pPr>
+        <w:pStyle w:val="ListParagraph"/>
+        <w:numPr>
+          <w:ilvl w:val="0"/>
+          <w:numId w:val="2"/>
+        </w:numPr>
+        <w:spacing w:after="90" w:line="276"/>
+      </w:pPr>
+      <w:r>
+        <w:rPr>
+          <w:sz w:val="21"/>
+          <w:szCs w:val="21"/>
+        </w:rPr>
+        <w:t xml:space="preserve">Tarama durumu sunucuda tutulur, panel yoklar. Sayfa yenilense ya da başka bir sekmeden bakılsa da taramanın sürdüğü ve hangi adımda olduğu görünür.</w:t>
+      </w:r>
+    </w:p>
+    <w:p>
+      <w:pPr>
+        <w:pStyle w:val="ListParagraph"/>
+        <w:numPr>
+          <w:ilvl w:val="0"/>
+          <w:numId w:val="2"/>
+        </w:numPr>
+        <w:spacing w:after="90" w:line="276"/>
+      </w:pPr>
+      <w:r>
+        <w:rPr>
+          <w:sz w:val="21"/>
+          <w:szCs w:val="21"/>
+        </w:rPr>
+        <w:t xml:space="preserve">Brifingin üstünde üretim damgası vardır. Damgasız gösterilen bir brifing, sabahtan kalma olduğu hâlde yeni taramanın çıktısı sanılıyordu.</w:t>
+      </w:r>
+    </w:p>
+    <w:p>
+      <w:pPr>
+        <w:pStyle w:val="ListParagraph"/>
+        <w:numPr>
+          <w:ilvl w:val="0"/>
+          <w:numId w:val="2"/>
+        </w:numPr>
+        <w:spacing w:after="90" w:line="276"/>
+      </w:pPr>
+      <w:r>
+        <w:rPr>
+          <w:sz w:val="21"/>
+          <w:szCs w:val="21"/>
+        </w:rPr>
+        <w:t xml:space="preserve">Panel 20 saniyede bir kendini yoklar; yazarken, okurken ya da bir işlem beklerken yenileme ertelenir.</w:t>
+      </w:r>
+    </w:p>
+    <w:p>
+      <w:pPr>
+        <w:pStyle w:val="ListParagraph"/>
+        <w:numPr>
+          <w:ilvl w:val="0"/>
+          <w:numId w:val="2"/>
+        </w:numPr>
+        <w:spacing w:after="90" w:line="276"/>
+      </w:pPr>
+      <w:r>
+        <w:rPr>
+          <w:sz w:val="21"/>
+          <w:szCs w:val="21"/>
+        </w:rPr>
+        <w:t xml:space="preserve">Sohbet state/sohbet.jsonl içinde saklanır: sayfa yenilenince konuşma kaybolmaz.</w:t>
+      </w:r>
+    </w:p>
+    <w:p>
+      <w:pPr>
+        <w:pStyle w:val="ListParagraph"/>
+        <w:numPr>
+          <w:ilvl w:val="0"/>
+          <w:numId w:val="2"/>
+        </w:numPr>
+        <w:spacing w:after="90" w:line="276"/>
+      </w:pPr>
+      <w:r>
+        <w:rPr>
+          <w:sz w:val="21"/>
+          <w:szCs w:val="21"/>
+        </w:rPr>
+        <w:t xml:space="preserve">Aynı anda iki tarama başlatılamaz; ikisi de aynı dosyalara yazar ve kredi iki kat harcanırdı.</w:t>
       </w:r>
     </w:p>
     <w:sectPr>

</xml_diff>